<commit_message>
Hosting priced per environment set by broker size; environment model, Pre-Prod as a temporary environment, documents rebuilt
</commit_message>
<xml_diff>
--- a/docs/package/02_Commercials/BrokerVerse_Commercial_Proposal_Note.docx
+++ b/docs/package/02_Commercials/BrokerVerse_Commercial_Proposal_Note.docx
@@ -10,7 +10,7 @@
       <w:r>
         <w:rPr/>
         <w:drawing>
-          <wp:anchor behindDoc="1" distT="0" distB="0" distL="0" distR="0" simplePos="0" locked="0" layoutInCell="0" allowOverlap="1" relativeHeight="23">
+          <wp:anchor behindDoc="1" distT="0" distB="0" distL="0" distR="0" simplePos="0" locked="0" layoutInCell="0" allowOverlap="1" relativeHeight="22">
             <wp:simplePos x="0" y="0"/>
             <wp:positionH relativeFrom="margin">
               <wp:posOffset>-914400</wp:posOffset>
@@ -55,7 +55,7 @@
           </wp:anchor>
         </w:drawing>
         <w:drawing>
-          <wp:anchor behindDoc="1" distT="0" distB="0" distL="0" distR="0" simplePos="0" locked="0" layoutInCell="0" allowOverlap="1" relativeHeight="34">
+          <wp:anchor behindDoc="1" distT="0" distB="0" distL="0" distR="0" simplePos="0" locked="0" layoutInCell="0" allowOverlap="1" relativeHeight="33">
             <wp:simplePos x="0" y="0"/>
             <wp:positionH relativeFrom="margin">
               <wp:align>center</wp:align>
@@ -111,7 +111,7 @@
         <mc:AlternateContent>
           <mc:Choice Requires="wps">
             <w:drawing>
-              <wp:anchor behindDoc="0" distT="45720" distB="45720" distL="114300" distR="114300" simplePos="0" locked="0" layoutInCell="0" allowOverlap="1" relativeHeight="24" wp14:anchorId="3D43415C">
+              <wp:anchor behindDoc="0" distT="45720" distB="45720" distL="114300" distR="114300" simplePos="0" locked="0" layoutInCell="0" allowOverlap="1" relativeHeight="23" wp14:anchorId="3D43415C">
                 <wp:simplePos x="0" y="0"/>
                 <wp:positionH relativeFrom="page">
                   <wp:posOffset>194310</wp:posOffset>
@@ -226,7 +226,7 @@
         <mc:AlternateContent>
           <mc:Choice Requires="wps">
             <w:drawing>
-              <wp:anchor behindDoc="0" distT="45720" distB="45720" distL="113030" distR="114935" simplePos="0" locked="0" layoutInCell="0" allowOverlap="1" relativeHeight="26" wp14:anchorId="58C23128">
+              <wp:anchor behindDoc="0" distT="45720" distB="45720" distL="113030" distR="114935" simplePos="0" locked="0" layoutInCell="0" allowOverlap="1" relativeHeight="25" wp14:anchorId="58C23128">
                 <wp:simplePos x="0" y="0"/>
                 <wp:positionH relativeFrom="page">
                   <wp:posOffset>3094990</wp:posOffset>
@@ -341,7 +341,7 @@
         <mc:AlternateContent>
           <mc:Choice Requires="wps">
             <w:drawing>
-              <wp:anchor behindDoc="0" distT="45720" distB="45720" distL="114300" distR="113665" simplePos="0" locked="0" layoutInCell="0" allowOverlap="1" relativeHeight="28" wp14:anchorId="1BF25123">
+              <wp:anchor behindDoc="0" distT="45720" distB="45720" distL="114300" distR="113665" simplePos="0" locked="0" layoutInCell="0" allowOverlap="1" relativeHeight="27" wp14:anchorId="1BF25123">
                 <wp:simplePos x="0" y="0"/>
                 <wp:positionH relativeFrom="page">
                   <wp:posOffset>4992370</wp:posOffset>
@@ -456,7 +456,7 @@
         <mc:AlternateContent>
           <mc:Choice Requires="wps">
             <w:drawing>
-              <wp:anchor behindDoc="0" distT="45720" distB="46355" distL="114300" distR="114300" simplePos="0" locked="0" layoutInCell="0" allowOverlap="1" relativeHeight="30" wp14:anchorId="01DE2BF4">
+              <wp:anchor behindDoc="0" distT="45720" distB="46355" distL="114300" distR="114300" simplePos="0" locked="0" layoutInCell="0" allowOverlap="1" relativeHeight="29" wp14:anchorId="01DE2BF4">
                 <wp:simplePos x="0" y="0"/>
                 <wp:positionH relativeFrom="margin">
                   <wp:align>center</wp:align>
@@ -601,7 +601,7 @@
         <mc:AlternateContent>
           <mc:Choice Requires="wps">
             <w:drawing>
-              <wp:anchor behindDoc="0" distT="45720" distB="50800" distL="114300" distR="114300" simplePos="0" locked="0" layoutInCell="0" allowOverlap="1" relativeHeight="32" wp14:anchorId="204C02CC">
+              <wp:anchor behindDoc="0" distT="45720" distB="50800" distL="114300" distR="114300" simplePos="0" locked="0" layoutInCell="0" allowOverlap="1" relativeHeight="31" wp14:anchorId="204C02CC">
                 <wp:simplePos x="0" y="0"/>
                 <wp:positionH relativeFrom="margin">
                   <wp:align>center</wp:align>
@@ -789,7 +789,7 @@
             </w:rPr>
             <w:fldChar w:fldCharType="separate"/>
           </w:r>
-          <w:hyperlink w:anchor="__RefHeading___Toc7884_3066934455">
+          <w:hyperlink w:anchor="__RefHeading___Toc2557_681460460">
             <w:r>
               <w:rPr>
                 <w:webHidden/>
@@ -824,7 +824,7 @@
             </w:tabs>
             <w:rPr/>
           </w:pPr>
-          <w:hyperlink w:anchor="__RefHeading___Toc7886_3066934455">
+          <w:hyperlink w:anchor="__RefHeading___Toc2559_681460460">
             <w:r>
               <w:rPr>
                 <w:webHidden/>
@@ -853,7 +853,7 @@
             </w:tabs>
             <w:rPr/>
           </w:pPr>
-          <w:hyperlink w:anchor="__RefHeading___Toc7888_3066934455">
+          <w:hyperlink w:anchor="__RefHeading___Toc2561_681460460">
             <w:r>
               <w:rPr>
                 <w:webHidden/>
@@ -875,7 +875,7 @@
             </w:tabs>
             <w:rPr/>
           </w:pPr>
-          <w:hyperlink w:anchor="__RefHeading___Toc7890_3066934455">
+          <w:hyperlink w:anchor="__RefHeading___Toc2563_681460460">
             <w:r>
               <w:rPr>
                 <w:webHidden/>
@@ -897,7 +897,7 @@
             </w:tabs>
             <w:rPr/>
           </w:pPr>
-          <w:hyperlink w:anchor="__RefHeading___Toc7892_3066934455">
+          <w:hyperlink w:anchor="__RefHeading___Toc2565_681460460">
             <w:r>
               <w:rPr>
                 <w:webHidden/>
@@ -919,7 +919,7 @@
             </w:tabs>
             <w:rPr/>
           </w:pPr>
-          <w:hyperlink w:anchor="__RefHeading___Toc7894_3066934455">
+          <w:hyperlink w:anchor="__RefHeading___Toc2567_681460460">
             <w:r>
               <w:rPr>
                 <w:webHidden/>
@@ -941,7 +941,7 @@
             </w:tabs>
             <w:rPr/>
           </w:pPr>
-          <w:hyperlink w:anchor="__RefHeading___Toc7896_3066934455">
+          <w:hyperlink w:anchor="__RefHeading___Toc2569_681460460">
             <w:r>
               <w:rPr>
                 <w:webHidden/>
@@ -963,7 +963,7 @@
             </w:tabs>
             <w:rPr/>
           </w:pPr>
-          <w:hyperlink w:anchor="__RefHeading___Toc7898_3066934455">
+          <w:hyperlink w:anchor="__RefHeading___Toc2571_681460460">
             <w:r>
               <w:rPr>
                 <w:webHidden/>
@@ -985,7 +985,7 @@
             </w:tabs>
             <w:rPr/>
           </w:pPr>
-          <w:hyperlink w:anchor="__RefHeading___Toc7900_3066934455">
+          <w:hyperlink w:anchor="__RefHeading___Toc2573_681460460">
             <w:r>
               <w:rPr>
                 <w:webHidden/>
@@ -1007,7 +1007,7 @@
             </w:tabs>
             <w:rPr/>
           </w:pPr>
-          <w:hyperlink w:anchor="__RefHeading___Toc7902_3066934455">
+          <w:hyperlink w:anchor="__RefHeading___Toc2575_681460460">
             <w:r>
               <w:rPr>
                 <w:webHidden/>
@@ -1029,7 +1029,7 @@
             </w:tabs>
             <w:rPr/>
           </w:pPr>
-          <w:hyperlink w:anchor="__RefHeading___Toc7904_3066934455">
+          <w:hyperlink w:anchor="__RefHeading___Toc2577_681460460">
             <w:r>
               <w:rPr>
                 <w:webHidden/>
@@ -1051,7 +1051,7 @@
             </w:tabs>
             <w:rPr/>
           </w:pPr>
-          <w:hyperlink w:anchor="__RefHeading___Toc7906_3066934455">
+          <w:hyperlink w:anchor="__RefHeading___Toc2579_681460460">
             <w:r>
               <w:rPr>
                 <w:webHidden/>
@@ -1073,7 +1073,7 @@
             </w:tabs>
             <w:rPr/>
           </w:pPr>
-          <w:hyperlink w:anchor="__RefHeading___Toc7908_3066934455">
+          <w:hyperlink w:anchor="__RefHeading___Toc2581_681460460">
             <w:r>
               <w:rPr>
                 <w:webHidden/>
@@ -1095,7 +1095,7 @@
             </w:tabs>
             <w:rPr/>
           </w:pPr>
-          <w:hyperlink w:anchor="__RefHeading___Toc7910_3066934455">
+          <w:hyperlink w:anchor="__RefHeading___Toc2583_681460460">
             <w:r>
               <w:rPr>
                 <w:webHidden/>
@@ -1117,7 +1117,7 @@
             </w:tabs>
             <w:rPr/>
           </w:pPr>
-          <w:hyperlink w:anchor="__RefHeading___Toc7912_3066934455">
+          <w:hyperlink w:anchor="__RefHeading___Toc2585_681460460">
             <w:r>
               <w:rPr>
                 <w:webHidden/>
@@ -1139,7 +1139,7 @@
             </w:tabs>
             <w:rPr/>
           </w:pPr>
-          <w:hyperlink w:anchor="__RefHeading___Toc7914_3066934455">
+          <w:hyperlink w:anchor="__RefHeading___Toc2587_681460460">
             <w:r>
               <w:rPr>
                 <w:webHidden/>
@@ -1161,7 +1161,7 @@
             </w:tabs>
             <w:rPr/>
           </w:pPr>
-          <w:hyperlink w:anchor="__RefHeading___Toc7916_3066934455">
+          <w:hyperlink w:anchor="__RefHeading___Toc2589_681460460">
             <w:r>
               <w:rPr>
                 <w:webHidden/>
@@ -1183,7 +1183,7 @@
             </w:tabs>
             <w:rPr/>
           </w:pPr>
-          <w:hyperlink w:anchor="__RefHeading___Toc7918_3066934455">
+          <w:hyperlink w:anchor="__RefHeading___Toc2591_681460460">
             <w:r>
               <w:rPr>
                 <w:webHidden/>
@@ -1205,7 +1205,7 @@
             </w:tabs>
             <w:rPr/>
           </w:pPr>
-          <w:hyperlink w:anchor="__RefHeading___Toc7920_3066934455">
+          <w:hyperlink w:anchor="__RefHeading___Toc2593_681460460">
             <w:r>
               <w:rPr>
                 <w:webHidden/>
@@ -1213,7 +1213,7 @@
               </w:rPr>
               <w:t>10. Change requests</w:t>
               <w:tab/>
-              <w:t>12</w:t>
+              <w:t>11</w:t>
             </w:r>
           </w:hyperlink>
         </w:p>
@@ -1227,7 +1227,7 @@
             </w:tabs>
             <w:rPr/>
           </w:pPr>
-          <w:hyperlink w:anchor="__RefHeading___Toc7922_3066934455">
+          <w:hyperlink w:anchor="__RefHeading___Toc2595_681460460">
             <w:r>
               <w:rPr>
                 <w:webHidden/>
@@ -1235,7 +1235,7 @@
               </w:rPr>
               <w:t>10.1 Day rates</w:t>
               <w:tab/>
-              <w:t>12</w:t>
+              <w:t>11</w:t>
             </w:r>
           </w:hyperlink>
         </w:p>
@@ -1249,7 +1249,7 @@
             </w:tabs>
             <w:rPr/>
           </w:pPr>
-          <w:hyperlink w:anchor="__RefHeading___Toc7924_3066934455">
+          <w:hyperlink w:anchor="__RefHeading___Toc2597_681460460">
             <w:r>
               <w:rPr>
                 <w:webHidden/>
@@ -1257,7 +1257,7 @@
               </w:rPr>
               <w:t>10.2 Estimation method</w:t>
               <w:tab/>
-              <w:t>12</w:t>
+              <w:t>11</w:t>
             </w:r>
           </w:hyperlink>
         </w:p>
@@ -1271,7 +1271,7 @@
             </w:tabs>
             <w:rPr/>
           </w:pPr>
-          <w:hyperlink w:anchor="__RefHeading___Toc7926_3066934455">
+          <w:hyperlink w:anchor="__RefHeading___Toc2599_681460460">
             <w:r>
               <w:rPr>
                 <w:webHidden/>
@@ -1279,7 +1279,7 @@
               </w:rPr>
               <w:t>11. Optional services</w:t>
               <w:tab/>
-              <w:t>13</w:t>
+              <w:t>12</w:t>
             </w:r>
           </w:hyperlink>
         </w:p>
@@ -1293,7 +1293,7 @@
             </w:tabs>
             <w:rPr/>
           </w:pPr>
-          <w:hyperlink w:anchor="__RefHeading___Toc7928_3066934455">
+          <w:hyperlink w:anchor="__RefHeading___Toc2601_681460460">
             <w:r>
               <w:rPr>
                 <w:webHidden/>
@@ -1301,7 +1301,7 @@
               </w:rPr>
               <w:t>12. Sample quotes</w:t>
               <w:tab/>
-              <w:t>14</w:t>
+              <w:t>13</w:t>
             </w:r>
           </w:hyperlink>
         </w:p>
@@ -1315,7 +1315,7 @@
             </w:tabs>
             <w:rPr/>
           </w:pPr>
-          <w:hyperlink w:anchor="__RefHeading___Toc7930_3066934455">
+          <w:hyperlink w:anchor="__RefHeading___Toc2603_681460460">
             <w:r>
               <w:rPr>
                 <w:webHidden/>
@@ -1323,7 +1323,7 @@
               </w:rPr>
               <w:t>13. Payment terms</w:t>
               <w:tab/>
-              <w:t>15</w:t>
+              <w:t>14</w:t>
             </w:r>
           </w:hyperlink>
         </w:p>
@@ -1337,7 +1337,7 @@
             </w:tabs>
             <w:rPr/>
           </w:pPr>
-          <w:hyperlink w:anchor="__RefHeading___Toc7932_3066934455">
+          <w:hyperlink w:anchor="__RefHeading___Toc2605_681460460">
             <w:r>
               <w:rPr>
                 <w:webHidden/>
@@ -1345,7 +1345,7 @@
               </w:rPr>
               <w:t>14. Taxes</w:t>
               <w:tab/>
-              <w:t>16</w:t>
+              <w:t>15</w:t>
             </w:r>
           </w:hyperlink>
         </w:p>
@@ -1359,7 +1359,7 @@
             </w:tabs>
             <w:rPr/>
           </w:pPr>
-          <w:hyperlink w:anchor="__RefHeading___Toc7934_3066934455">
+          <w:hyperlink w:anchor="__RefHeading___Toc2607_681460460">
             <w:r>
               <w:rPr>
                 <w:webHidden/>
@@ -1367,7 +1367,7 @@
               </w:rPr>
               <w:t>15. Validity and assumptions</w:t>
               <w:tab/>
-              <w:t>17</w:t>
+              <w:t>16</w:t>
             </w:r>
           </w:hyperlink>
         </w:p>
@@ -1381,7 +1381,7 @@
             </w:tabs>
             <w:rPr/>
           </w:pPr>
-          <w:hyperlink w:anchor="__RefHeading___Toc7936_3066934455">
+          <w:hyperlink w:anchor="__RefHeading___Toc2609_681460460">
             <w:r>
               <w:rPr>
                 <w:webHidden/>
@@ -1389,7 +1389,7 @@
               </w:rPr>
               <w:t>16. Recommendation</w:t>
               <w:tab/>
-              <w:t>18</w:t>
+              <w:t>17</w:t>
             </w:r>
           </w:hyperlink>
         </w:p>
@@ -1403,7 +1403,7 @@
             </w:tabs>
             <w:rPr/>
           </w:pPr>
-          <w:hyperlink w:anchor="__RefHeading___Toc7938_3066934455">
+          <w:hyperlink w:anchor="__RefHeading___Toc2611_681460460">
             <w:r>
               <w:rPr>
                 <w:webHidden/>
@@ -1418,7 +1418,7 @@
                 <w:rStyle w:val="IndexLink"/>
               </w:rPr>
               <w:tab/>
-              <w:t>19</w:t>
+              <w:t>18</w:t>
             </w:r>
           </w:hyperlink>
           <w:r>
@@ -1451,7 +1451,7 @@
       <w:r>
         <w:br w:type="page"/>
       </w:r>
-      <w:bookmarkStart w:id="0" w:name="__RefHeading___Toc7884_3066934455"/>
+      <w:bookmarkStart w:id="0" w:name="__RefHeading___Toc2557_681460460"/>
       <w:bookmarkStart w:id="1" w:name="_Toc48319687"/>
       <w:bookmarkStart w:id="2" w:name="_Toc11824118"/>
       <w:bookmarkEnd w:id="0"/>
@@ -2096,7 +2096,7 @@
           <w:spacing w:val="0"/>
         </w:rPr>
       </w:pPr>
-      <w:bookmarkStart w:id="4" w:name="__RefHeading___Toc7886_3066934455"/>
+      <w:bookmarkStart w:id="4" w:name="__RefHeading___Toc2559_681460460"/>
       <w:bookmarkStart w:id="5" w:name="_Toc233203388"/>
       <w:bookmarkEnd w:id="4"/>
       <w:r>
@@ -3796,7 +3796,7 @@
         <w:pageBreakBefore w:val="false"/>
         <w:rPr/>
       </w:pPr>
-      <w:bookmarkStart w:id="6" w:name="__RefHeading___Toc7888_3066934455"/>
+      <w:bookmarkStart w:id="6" w:name="__RefHeading___Toc2561_681460460"/>
       <w:bookmarkEnd w:id="6"/>
       <w:r>
         <w:rPr>
@@ -3894,7 +3894,7 @@
         <w:pStyle w:val="Heading1"/>
         <w:rPr/>
       </w:pPr>
-      <w:bookmarkStart w:id="7" w:name="__RefHeading___Toc7890_3066934455"/>
+      <w:bookmarkStart w:id="7" w:name="__RefHeading___Toc2563_681460460"/>
       <w:bookmarkEnd w:id="7"/>
       <w:r>
         <w:rPr>
@@ -3911,7 +3911,7 @@
         <w:pStyle w:val="Heading2"/>
         <w:rPr/>
       </w:pPr>
-      <w:bookmarkStart w:id="8" w:name="__RefHeading___Toc7892_3066934455"/>
+      <w:bookmarkStart w:id="8" w:name="__RefHeading___Toc2565_681460460"/>
       <w:bookmarkEnd w:id="8"/>
       <w:r>
         <w:rPr>
@@ -4924,7 +4924,7 @@
         <w:pStyle w:val="Heading2"/>
         <w:rPr/>
       </w:pPr>
-      <w:bookmarkStart w:id="9" w:name="__RefHeading___Toc7894_3066934455"/>
+      <w:bookmarkStart w:id="9" w:name="__RefHeading___Toc2567_681460460"/>
       <w:bookmarkEnd w:id="9"/>
       <w:r>
         <w:rPr>
@@ -4971,7 +4971,7 @@
         <w:pStyle w:val="Heading2"/>
         <w:rPr/>
       </w:pPr>
-      <w:bookmarkStart w:id="10" w:name="__RefHeading___Toc7896_3066934455"/>
+      <w:bookmarkStart w:id="10" w:name="__RefHeading___Toc2569_681460460"/>
       <w:bookmarkEnd w:id="10"/>
       <w:r>
         <w:rPr>
@@ -5006,7 +5006,7 @@
         <w:pStyle w:val="Heading1"/>
         <w:rPr/>
       </w:pPr>
-      <w:bookmarkStart w:id="11" w:name="__RefHeading___Toc7898_3066934455"/>
+      <w:bookmarkStart w:id="11" w:name="__RefHeading___Toc2571_681460460"/>
       <w:bookmarkEnd w:id="11"/>
       <w:r>
         <w:rPr>
@@ -5853,7 +5853,7 @@
         <w:pStyle w:val="Heading1"/>
         <w:rPr/>
       </w:pPr>
-      <w:bookmarkStart w:id="12" w:name="__RefHeading___Toc7900_3066934455"/>
+      <w:bookmarkStart w:id="12" w:name="__RefHeading___Toc2573_681460460"/>
       <w:bookmarkEnd w:id="12"/>
       <w:r>
         <w:rPr>
@@ -5870,7 +5870,7 @@
         <w:pStyle w:val="Heading2"/>
         <w:rPr/>
       </w:pPr>
-      <w:bookmarkStart w:id="13" w:name="__RefHeading___Toc7902_3066934455"/>
+      <w:bookmarkStart w:id="13" w:name="__RefHeading___Toc2575_681460460"/>
       <w:bookmarkEnd w:id="13"/>
       <w:r>
         <w:rPr>
@@ -6741,7 +6741,7 @@
         <w:pStyle w:val="Heading2"/>
         <w:rPr/>
       </w:pPr>
-      <w:bookmarkStart w:id="14" w:name="__RefHeading___Toc7904_3066934455"/>
+      <w:bookmarkStart w:id="14" w:name="__RefHeading___Toc2577_681460460"/>
       <w:bookmarkEnd w:id="14"/>
       <w:r>
         <w:rPr>
@@ -6863,7 +6863,7 @@
         <w:pStyle w:val="Heading1"/>
         <w:rPr/>
       </w:pPr>
-      <w:bookmarkStart w:id="15" w:name="__RefHeading___Toc7906_3066934455"/>
+      <w:bookmarkStart w:id="15" w:name="__RefHeading___Toc2579_681460460"/>
       <w:bookmarkEnd w:id="15"/>
       <w:r>
         <w:rPr>
@@ -6880,7 +6880,7 @@
         <w:pStyle w:val="Heading2"/>
         <w:rPr/>
       </w:pPr>
-      <w:bookmarkStart w:id="16" w:name="__RefHeading___Toc7908_3066934455"/>
+      <w:bookmarkStart w:id="16" w:name="__RefHeading___Toc2581_681460460"/>
       <w:bookmarkEnd w:id="16"/>
       <w:r>
         <w:rPr>
@@ -7770,7 +7770,7 @@
         <w:pStyle w:val="Heading2"/>
         <w:rPr/>
       </w:pPr>
-      <w:bookmarkStart w:id="17" w:name="__RefHeading___Toc7910_3066934455"/>
+      <w:bookmarkStart w:id="17" w:name="__RefHeading___Toc2583_681460460"/>
       <w:bookmarkEnd w:id="17"/>
       <w:r>
         <w:rPr>
@@ -8617,7 +8617,7 @@
         <w:pStyle w:val="Heading1"/>
         <w:rPr/>
       </w:pPr>
-      <w:bookmarkStart w:id="18" w:name="__RefHeading___Toc7912_3066934455"/>
+      <w:bookmarkStart w:id="18" w:name="__RefHeading___Toc2585_681460460"/>
       <w:bookmarkEnd w:id="18"/>
       <w:r>
         <w:rPr>
@@ -9804,7 +9804,7 @@
         <w:pStyle w:val="Heading1"/>
         <w:rPr/>
       </w:pPr>
-      <w:bookmarkStart w:id="19" w:name="__RefHeading___Toc7914_3066934455"/>
+      <w:bookmarkStart w:id="19" w:name="__RefHeading___Toc2587_681460460"/>
       <w:bookmarkEnd w:id="19"/>
       <w:r>
         <w:rPr>
@@ -9836,7 +9836,7 @@
         <w:pStyle w:val="Heading2"/>
         <w:rPr/>
       </w:pPr>
-      <w:bookmarkStart w:id="20" w:name="__RefHeading___Toc7916_3066934455"/>
+      <w:bookmarkStart w:id="20" w:name="__RefHeading___Toc2589_681460460"/>
       <w:bookmarkEnd w:id="20"/>
       <w:r>
         <w:rPr>
@@ -9851,7 +9851,7 @@
     <w:tbl>
       <w:tblPr>
         <w:tblStyle w:val="TableGrid"/>
-        <w:tblW w:w="9015" w:type="dxa"/>
+        <w:tblW w:w="9014" w:type="dxa"/>
         <w:jc w:val="left"/>
         <w:tblInd w:w="0" w:type="dxa"/>
         <w:tblLayout w:type="fixed"/>
@@ -9864,9 +9864,8 @@
         <w:tblLook w:val="04a0" w:noHBand="0" w:noVBand="1" w:firstColumn="1" w:lastRow="0" w:lastColumn="0" w:firstRow="1"/>
       </w:tblPr>
       <w:tblGrid>
-        <w:gridCol w:w="2297"/>
-        <w:gridCol w:w="5475"/>
-        <w:gridCol w:w="1243"/>
+        <w:gridCol w:w="2651"/>
+        <w:gridCol w:w="6362"/>
       </w:tblGrid>
       <w:tr>
         <w:trPr>
@@ -9874,7 +9873,7 @@
         </w:trPr>
         <w:tc>
           <w:tcPr>
-            <w:tcW w:w="2297" w:type="dxa"/>
+            <w:tcW w:w="2651" w:type="dxa"/>
             <w:tcBorders>
               <w:top w:val="single" w:sz="4" w:space="0" w:color="BFC7D1"/>
               <w:left w:val="single" w:sz="4" w:space="0" w:color="BFC7D1"/>
@@ -9913,7 +9912,7 @@
         </w:tc>
         <w:tc>
           <w:tcPr>
-            <w:tcW w:w="5475" w:type="dxa"/>
+            <w:tcW w:w="6362" w:type="dxa"/>
             <w:tcBorders>
               <w:top w:val="single" w:sz="4" w:space="0" w:color="BFC7D1"/>
               <w:left w:val="single" w:sz="4" w:space="0" w:color="BFC7D1"/>
@@ -9947,45 +9946,6 @@
                 <w:lang w:val="en-US" w:eastAsia="ja-JP" w:bidi="ar-SA"/>
               </w:rPr>
               <w:t>Standing environments</w:t>
-            </w:r>
-          </w:p>
-        </w:tc>
-        <w:tc>
-          <w:tcPr>
-            <w:tcW w:w="1243" w:type="dxa"/>
-            <w:tcBorders>
-              <w:top w:val="single" w:sz="4" w:space="0" w:color="BFC7D1"/>
-              <w:left w:val="single" w:sz="4" w:space="0" w:color="BFC7D1"/>
-              <w:bottom w:val="single" w:sz="4" w:space="0" w:color="BFC7D1"/>
-              <w:right w:val="single" w:sz="4" w:space="0" w:color="BFC7D1"/>
-            </w:tcBorders>
-            <w:shd w:color="auto" w:fill="DCE9F7" w:val="clear"/>
-          </w:tcPr>
-          <w:p>
-            <w:pPr>
-              <w:pStyle w:val="Normal"/>
-              <w:widowControl/>
-              <w:spacing w:lineRule="auto" w:line="240" w:before="0" w:after="20"/>
-              <w:jc w:val="left"/>
-              <w:rPr>
-                <w:rFonts w:ascii="Aptos" w:hAnsi="Aptos" w:eastAsia="ＭＳ 明朝" w:cs="Arial"/>
-                <w:kern w:val="0"/>
-                <w:sz w:val="24"/>
-                <w:szCs w:val="24"/>
-                <w:lang w:val="en-US" w:eastAsia="ja-JP" w:bidi="ar-SA"/>
-              </w:rPr>
-            </w:pPr>
-            <w:r>
-              <w:rPr>
-                <w:rFonts w:eastAsia="Segoe UI" w:cs="Segoe UI" w:ascii="Segoe UI" w:hAnsi="Segoe UI"/>
-                <w:b/>
-                <w:color w:val="0F4761"/>
-                <w:kern w:val="0"/>
-                <w:sz w:val="18"/>
-                <w:szCs w:val="24"/>
-                <w:lang w:val="en-US" w:eastAsia="ja-JP" w:bidi="ar-SA"/>
-              </w:rPr>
-              <w:t>Temporary</w:t>
             </w:r>
           </w:p>
         </w:tc>
@@ -9994,7 +9954,7 @@
         <w:trPr/>
         <w:tc>
           <w:tcPr>
-            <w:tcW w:w="2297" w:type="dxa"/>
+            <w:tcW w:w="2651" w:type="dxa"/>
             <w:tcBorders>
               <w:top w:val="single" w:sz="4" w:space="0" w:color="BFC7D1"/>
               <w:left w:val="single" w:sz="4" w:space="0" w:color="BFC7D1"/>
@@ -10031,7 +9991,7 @@
         </w:tc>
         <w:tc>
           <w:tcPr>
-            <w:tcW w:w="5475" w:type="dxa"/>
+            <w:tcW w:w="6362" w:type="dxa"/>
             <w:tcBorders>
               <w:top w:val="single" w:sz="4" w:space="0" w:color="BFC7D1"/>
               <w:left w:val="single" w:sz="4" w:space="0" w:color="BFC7D1"/>
@@ -10063,43 +10023,6 @@
                 <w:lang w:val="en-US" w:eastAsia="ja-JP" w:bidi="ar-SA"/>
               </w:rPr>
               <w:t>Dev, UAT, Production. Integration and system testing in Dev, promoted to UAT for testing, then to Production</w:t>
-            </w:r>
-          </w:p>
-        </w:tc>
-        <w:tc>
-          <w:tcPr>
-            <w:tcW w:w="1243" w:type="dxa"/>
-            <w:tcBorders>
-              <w:top w:val="single" w:sz="4" w:space="0" w:color="BFC7D1"/>
-              <w:left w:val="single" w:sz="4" w:space="0" w:color="BFC7D1"/>
-              <w:bottom w:val="single" w:sz="4" w:space="0" w:color="BFC7D1"/>
-              <w:right w:val="single" w:sz="4" w:space="0" w:color="BFC7D1"/>
-            </w:tcBorders>
-          </w:tcPr>
-          <w:p>
-            <w:pPr>
-              <w:pStyle w:val="Normal"/>
-              <w:widowControl/>
-              <w:spacing w:lineRule="auto" w:line="240" w:before="0" w:after="20"/>
-              <w:jc w:val="left"/>
-              <w:rPr>
-                <w:rFonts w:ascii="Aptos" w:hAnsi="Aptos" w:eastAsia="ＭＳ 明朝" w:cs="Arial"/>
-                <w:kern w:val="0"/>
-                <w:sz w:val="24"/>
-                <w:szCs w:val="24"/>
-                <w:lang w:val="en-US" w:eastAsia="ja-JP" w:bidi="ar-SA"/>
-              </w:rPr>
-            </w:pPr>
-            <w:r>
-              <w:rPr>
-                <w:rFonts w:eastAsia="Segoe UI" w:cs="Segoe UI" w:ascii="Segoe UI" w:hAnsi="Segoe UI"/>
-                <w:color w:val="101820"/>
-                <w:kern w:val="0"/>
-                <w:sz w:val="18"/>
-                <w:szCs w:val="24"/>
-                <w:lang w:val="en-US" w:eastAsia="ja-JP" w:bidi="ar-SA"/>
-              </w:rPr>
-              <w:t>Pre-Prod</w:t>
             </w:r>
           </w:p>
         </w:tc>
@@ -10108,7 +10031,7 @@
         <w:trPr/>
         <w:tc>
           <w:tcPr>
-            <w:tcW w:w="2297" w:type="dxa"/>
+            <w:tcW w:w="2651" w:type="dxa"/>
             <w:tcBorders>
               <w:top w:val="single" w:sz="4" w:space="0" w:color="BFC7D1"/>
               <w:left w:val="single" w:sz="4" w:space="0" w:color="BFC7D1"/>
@@ -10145,7 +10068,7 @@
         </w:tc>
         <w:tc>
           <w:tcPr>
-            <w:tcW w:w="5475" w:type="dxa"/>
+            <w:tcW w:w="6362" w:type="dxa"/>
             <w:tcBorders>
               <w:top w:val="single" w:sz="4" w:space="0" w:color="BFC7D1"/>
               <w:left w:val="single" w:sz="4" w:space="0" w:color="BFC7D1"/>
@@ -10177,43 +10100,6 @@
                 <w:lang w:val="en-US" w:eastAsia="ja-JP" w:bidi="ar-SA"/>
               </w:rPr>
               <w:t>Dev, SIT, UAT, Production with high availability. SIT and UAT are separate</w:t>
-            </w:r>
-          </w:p>
-        </w:tc>
-        <w:tc>
-          <w:tcPr>
-            <w:tcW w:w="1243" w:type="dxa"/>
-            <w:tcBorders>
-              <w:top w:val="single" w:sz="4" w:space="0" w:color="BFC7D1"/>
-              <w:left w:val="single" w:sz="4" w:space="0" w:color="BFC7D1"/>
-              <w:bottom w:val="single" w:sz="4" w:space="0" w:color="BFC7D1"/>
-              <w:right w:val="single" w:sz="4" w:space="0" w:color="BFC7D1"/>
-            </w:tcBorders>
-          </w:tcPr>
-          <w:p>
-            <w:pPr>
-              <w:pStyle w:val="Normal"/>
-              <w:widowControl/>
-              <w:spacing w:lineRule="auto" w:line="240" w:before="0" w:after="20"/>
-              <w:jc w:val="left"/>
-              <w:rPr>
-                <w:rFonts w:ascii="Aptos" w:hAnsi="Aptos" w:eastAsia="ＭＳ 明朝" w:cs="Arial"/>
-                <w:kern w:val="0"/>
-                <w:sz w:val="24"/>
-                <w:szCs w:val="24"/>
-                <w:lang w:val="en-US" w:eastAsia="ja-JP" w:bidi="ar-SA"/>
-              </w:rPr>
-            </w:pPr>
-            <w:r>
-              <w:rPr>
-                <w:rFonts w:eastAsia="Segoe UI" w:cs="Segoe UI" w:ascii="Segoe UI" w:hAnsi="Segoe UI"/>
-                <w:color w:val="101820"/>
-                <w:kern w:val="0"/>
-                <w:sz w:val="18"/>
-                <w:szCs w:val="24"/>
-                <w:lang w:val="en-US" w:eastAsia="ja-JP" w:bidi="ar-SA"/>
-              </w:rPr>
-              <w:t>Pre-Prod</w:t>
             </w:r>
           </w:p>
         </w:tc>
@@ -10241,7 +10127,7 @@
           <w:color w:val="101820"/>
           <w:sz w:val="21"/>
         </w:rPr>
-        <w:t>Pre-Prod is created from a production backup for the go-live rehearsal and for each major release, then removed. A copy used by people without production access is masked.</w:t>
+        <w:t>Every tier also has a temporary Pre-Prod. It is created from a production backup for the go-live rehearsal and for each major release, then removed. A copy used by people without production access is masked.</w:t>
       </w:r>
     </w:p>
     <w:p>
@@ -10249,7 +10135,7 @@
         <w:pStyle w:val="Heading2"/>
         <w:rPr/>
       </w:pPr>
-      <w:bookmarkStart w:id="21" w:name="__RefHeading___Toc7918_3066934455"/>
+      <w:bookmarkStart w:id="21" w:name="__RefHeading___Toc2591_681460460"/>
       <w:bookmarkEnd w:id="21"/>
       <w:r>
         <w:rPr>
@@ -11364,7 +11250,7 @@
         <w:pStyle w:val="Heading1"/>
         <w:rPr/>
       </w:pPr>
-      <w:bookmarkStart w:id="22" w:name="__RefHeading___Toc7920_3066934455"/>
+      <w:bookmarkStart w:id="22" w:name="__RefHeading___Toc2593_681460460"/>
       <w:bookmarkEnd w:id="22"/>
       <w:r>
         <w:rPr>
@@ -11381,7 +11267,7 @@
         <w:pStyle w:val="Heading2"/>
         <w:rPr/>
       </w:pPr>
-      <w:bookmarkStart w:id="23" w:name="__RefHeading___Toc7922_3066934455"/>
+      <w:bookmarkStart w:id="23" w:name="__RefHeading___Toc2595_681460460"/>
       <w:bookmarkEnd w:id="23"/>
       <w:r>
         <w:rPr>
@@ -12136,7 +12022,7 @@
         <w:pStyle w:val="Heading2"/>
         <w:rPr/>
       </w:pPr>
-      <w:bookmarkStart w:id="24" w:name="__RefHeading___Toc7924_3066934455"/>
+      <w:bookmarkStart w:id="24" w:name="__RefHeading___Toc2597_681460460"/>
       <w:bookmarkEnd w:id="24"/>
       <w:r>
         <w:rPr>
@@ -12893,7 +12779,7 @@
         <w:pStyle w:val="Heading1"/>
         <w:rPr/>
       </w:pPr>
-      <w:bookmarkStart w:id="25" w:name="__RefHeading___Toc7926_3066934455"/>
+      <w:bookmarkStart w:id="25" w:name="__RefHeading___Toc2599_681460460"/>
       <w:bookmarkEnd w:id="25"/>
       <w:r>
         <w:rPr>
@@ -13657,7 +13543,7 @@
         <w:pStyle w:val="Heading1"/>
         <w:rPr/>
       </w:pPr>
-      <w:bookmarkStart w:id="26" w:name="__RefHeading___Toc7928_3066934455"/>
+      <w:bookmarkStart w:id="26" w:name="__RefHeading___Toc2601_681460460"/>
       <w:bookmarkEnd w:id="26"/>
       <w:r>
         <w:rPr>
@@ -14353,7 +14239,7 @@
         <w:pStyle w:val="Heading1"/>
         <w:rPr/>
       </w:pPr>
-      <w:bookmarkStart w:id="27" w:name="__RefHeading___Toc7930_3066934455"/>
+      <w:bookmarkStart w:id="27" w:name="__RefHeading___Toc2603_681460460"/>
       <w:bookmarkEnd w:id="27"/>
       <w:r>
         <w:rPr>
@@ -15040,7 +14926,7 @@
         <w:pStyle w:val="Heading1"/>
         <w:rPr/>
       </w:pPr>
-      <w:bookmarkStart w:id="28" w:name="__RefHeading___Toc7932_3066934455"/>
+      <w:bookmarkStart w:id="28" w:name="__RefHeading___Toc2605_681460460"/>
       <w:bookmarkEnd w:id="28"/>
       <w:r>
         <w:rPr>
@@ -15117,7 +15003,7 @@
         <w:pStyle w:val="Heading1"/>
         <w:rPr/>
       </w:pPr>
-      <w:bookmarkStart w:id="29" w:name="__RefHeading___Toc7934_3066934455"/>
+      <w:bookmarkStart w:id="29" w:name="__RefHeading___Toc2607_681460460"/>
       <w:bookmarkEnd w:id="29"/>
       <w:r>
         <w:rPr>
@@ -15251,7 +15137,7 @@
         <w:pStyle w:val="Heading1"/>
         <w:rPr/>
       </w:pPr>
-      <w:bookmarkStart w:id="30" w:name="__RefHeading___Toc7936_3066934455"/>
+      <w:bookmarkStart w:id="30" w:name="__RefHeading___Toc2609_681460460"/>
       <w:bookmarkEnd w:id="30"/>
       <w:r>
         <w:rPr>
@@ -15361,7 +15247,7 @@
           <w:spacing w:val="0"/>
         </w:rPr>
       </w:pPr>
-      <w:bookmarkStart w:id="31" w:name="__RefHeading___Toc7938_3066934455"/>
+      <w:bookmarkStart w:id="31" w:name="__RefHeading___Toc2611_681460460"/>
       <w:bookmarkStart w:id="32" w:name="_Toc233203395"/>
       <w:bookmarkEnd w:id="31"/>
       <w:r>
@@ -17119,7 +17005,7 @@
       <w:r>
         <w:rPr/>
         <w:drawing>
-          <wp:anchor behindDoc="1" distT="0" distB="0" distL="0" distR="0" simplePos="0" locked="0" layoutInCell="0" allowOverlap="1" relativeHeight="22">
+          <wp:anchor behindDoc="1" distT="0" distB="0" distL="0" distR="0" simplePos="0" locked="0" layoutInCell="0" allowOverlap="1" relativeHeight="21">
             <wp:simplePos x="0" y="0"/>
             <wp:positionH relativeFrom="margin">
               <wp:align>center</wp:align>
@@ -17190,7 +17076,7 @@
     <w:r>
       <w:rPr/>
       <w:drawing>
-        <wp:anchor behindDoc="1" distT="0" distB="0" distL="0" distR="0" simplePos="0" locked="0" layoutInCell="0" allowOverlap="1" relativeHeight="21">
+        <wp:anchor behindDoc="1" distT="0" distB="0" distL="0" distR="0" simplePos="0" locked="0" layoutInCell="0" allowOverlap="1" relativeHeight="20">
           <wp:simplePos x="0" y="0"/>
           <wp:positionH relativeFrom="page">
             <wp:align>left</wp:align>
@@ -17249,7 +17135,7 @@
     <w:r>
       <w:rPr/>
       <w:drawing>
-        <wp:anchor behindDoc="1" distT="0" distB="0" distL="0" distR="0" simplePos="0" locked="0" layoutInCell="0" allowOverlap="1" relativeHeight="21">
+        <wp:anchor behindDoc="1" distT="0" distB="0" distL="0" distR="0" simplePos="0" locked="0" layoutInCell="0" allowOverlap="1" relativeHeight="20">
           <wp:simplePos x="0" y="0"/>
           <wp:positionH relativeFrom="page">
             <wp:align>left</wp:align>

</xml_diff>